<commit_message>
Pending Requirements & Tasks
</commit_message>
<xml_diff>
--- a/Other Files/Features, Phases & Integration Strategy - Algorithmic Trading System.docx
+++ b/Other Files/Features, Phases & Integration Strategy - Algorithmic Trading System.docx
@@ -4748,21 +4748,7 @@
         <w:rPr>
           <w:rFonts w:cs="Arabic Typesetting"/>
         </w:rPr>
-        <w:t xml:space="preserve"> environment consistent with the production live trading environment. It's design, architecture, and implementation philosophy </w:t>
-      </w:r>
-      <w:proofErr w:type="gramStart"/>
-      <w:r>
-        <w:rPr>
-          <w:rFonts w:cs="Arabic Typesetting"/>
-        </w:rPr>
-        <w:t>prioritises</w:t>
-      </w:r>
-      <w:proofErr w:type="gramEnd"/>
-      <w:r>
-        <w:rPr>
-          <w:rFonts w:cs="Arabic Typesetting"/>
-        </w:rPr>
-        <w:t xml:space="preserve"> software correctness and safety at the highest level, with the aim of supporting Python-native, mission-critical, trading system </w:t>
+        <w:t xml:space="preserve"> environment consistent with the production live trading environment. It's design, architecture, and implementation philosophy prioritises software correctness and safety at the highest level, with the aim of supporting Python-native, mission-critical, trading system </w:t>
       </w:r>
       <w:proofErr w:type="spellStart"/>
       <w:r>
@@ -8252,21 +8238,7 @@
         <w:rPr>
           <w:rFonts w:cs="Arabic Typesetting"/>
         </w:rPr>
-        <w:t xml:space="preserve">It enables client and server applications to communicate </w:t>
-      </w:r>
-      <w:proofErr w:type="gramStart"/>
-      <w:r>
-        <w:rPr>
-          <w:rFonts w:cs="Arabic Typesetting"/>
-        </w:rPr>
-        <w:t>transparently, and</w:t>
-      </w:r>
-      <w:proofErr w:type="gramEnd"/>
-      <w:r>
-        <w:rPr>
-          <w:rFonts w:cs="Arabic Typesetting"/>
-        </w:rPr>
-        <w:t xml:space="preserve"> simplifies the building of connected systems.</w:t>
+        <w:t>It enables client and server applications to communicate transparently, and simplifies the building of connected systems.</w:t>
       </w:r>
     </w:p>
     <w:p>
@@ -8500,21 +8472,7 @@
         <w:rPr>
           <w:rFonts w:cs="Arabic Typesetting"/>
         </w:rPr>
-        <w:t xml:space="preserve">ne click </w:t>
-      </w:r>
-      <w:proofErr w:type="gramStart"/>
-      <w:r>
-        <w:rPr>
-          <w:rFonts w:cs="Arabic Typesetting"/>
-        </w:rPr>
-        <w:t>install</w:t>
-      </w:r>
-      <w:proofErr w:type="gramEnd"/>
-      <w:r>
-        <w:rPr>
-          <w:rFonts w:cs="Arabic Typesetting"/>
-        </w:rPr>
-        <w:t xml:space="preserve"> MCP Marketplace and Artifacts / Thinking.</w:t>
+        <w:t>ne click install MCP Marketplace and Artifacts / Thinking.</w:t>
       </w:r>
     </w:p>
     <w:p>
@@ -10673,21 +10631,7 @@
         <w:rPr>
           <w:rFonts w:cs="Arabic Typesetting"/>
         </w:rPr>
-        <w:t xml:space="preserve">It is a 100% Java </w:t>
-      </w:r>
-      <w:proofErr w:type="gramStart"/>
-      <w:r>
-        <w:rPr>
-          <w:rFonts w:cs="Arabic Typesetting"/>
-        </w:rPr>
-        <w:t>open source</w:t>
-      </w:r>
-      <w:proofErr w:type="gramEnd"/>
-      <w:r>
-        <w:rPr>
-          <w:rFonts w:cs="Arabic Typesetting"/>
-        </w:rPr>
-        <w:t xml:space="preserve"> implementation of the popular C++ </w:t>
+        <w:t xml:space="preserve">It is a 100% Java open source implementation of the popular C++ </w:t>
       </w:r>
       <w:proofErr w:type="spellStart"/>
       <w:r>
@@ -12255,21 +12199,7 @@
         <w:rPr>
           <w:rFonts w:cs="Arabic Typesetting"/>
         </w:rPr>
-        <w:t xml:space="preserve">Works with </w:t>
-      </w:r>
-      <w:proofErr w:type="gramStart"/>
-      <w:r>
-        <w:rPr>
-          <w:rFonts w:cs="Arabic Typesetting"/>
-        </w:rPr>
-        <w:t>native-threads</w:t>
-      </w:r>
-      <w:proofErr w:type="gramEnd"/>
-      <w:r>
-        <w:rPr>
-          <w:rFonts w:cs="Arabic Typesetting"/>
-        </w:rPr>
-        <w:t xml:space="preserve"> (e.g. C++ threads in C extensions).</w:t>
+        <w:t>Works with native-threads (e.g. C++ threads in C extensions).</w:t>
       </w:r>
     </w:p>
     <w:p>
@@ -18221,21 +18151,7 @@
         <w:rPr>
           <w:rFonts w:cs="Arabic Typesetting"/>
         </w:rPr>
-        <w:t xml:space="preserve">: </w:t>
-      </w:r>
-      <w:proofErr w:type="gramStart"/>
-      <w:r>
-        <w:rPr>
-          <w:rFonts w:cs="Arabic Typesetting"/>
-        </w:rPr>
-        <w:t>Low-latency</w:t>
-      </w:r>
-      <w:proofErr w:type="gramEnd"/>
-      <w:r>
-        <w:rPr>
-          <w:rFonts w:cs="Arabic Typesetting"/>
-        </w:rPr>
-        <w:t xml:space="preserve"> streaming for market data.</w:t>
+        <w:t>: Low-latency streaming for market data.</w:t>
       </w:r>
     </w:p>
     <w:p>
@@ -19899,6 +19815,1084 @@
         <w:spacing w:line="240" w:lineRule="auto"/>
         <w:rPr>
           <w:rFonts w:cs="Arabic Typesetting"/>
+        </w:rPr>
+      </w:pPr>
+      <w:r>
+        <w:rPr>
+          <w:rFonts w:cs="Arabic Typesetting"/>
+        </w:rPr>
+        <w:t>https://github.com/nautechsystems/nautilus_trader</w:t>
+      </w:r>
+    </w:p>
+    <w:p>
+      <w:pPr>
+        <w:spacing w:line="240" w:lineRule="auto"/>
+        <w:rPr>
+          <w:rFonts w:cs="Arabic Typesetting"/>
+        </w:rPr>
+      </w:pPr>
+    </w:p>
+    <w:p>
+      <w:pPr>
+        <w:spacing w:line="240" w:lineRule="auto"/>
+        <w:rPr>
+          <w:rFonts w:cs="Arabic Typesetting"/>
+        </w:rPr>
+      </w:pPr>
+      <w:r>
+        <w:rPr>
+          <w:rFonts w:cs="Arabic Typesetting"/>
+        </w:rPr>
+        <w:t>https://github.com/nautechsystems/nautilus_ibapi</w:t>
+      </w:r>
+    </w:p>
+    <w:p>
+      <w:pPr>
+        <w:spacing w:line="240" w:lineRule="auto"/>
+        <w:rPr>
+          <w:rFonts w:cs="Arabic Typesetting"/>
+        </w:rPr>
+      </w:pPr>
+    </w:p>
+    <w:p>
+      <w:pPr>
+        <w:spacing w:line="240" w:lineRule="auto"/>
+        <w:rPr>
+          <w:rFonts w:cs="Arabic Typesetting"/>
+        </w:rPr>
+      </w:pPr>
+      <w:r>
+        <w:rPr>
+          <w:rFonts w:cs="Arabic Typesetting"/>
+        </w:rPr>
+        <w:t>https://github.com/apache/kafka</w:t>
+      </w:r>
+    </w:p>
+    <w:p>
+      <w:pPr>
+        <w:spacing w:line="240" w:lineRule="auto"/>
+        <w:rPr>
+          <w:rFonts w:cs="Arabic Typesetting"/>
+        </w:rPr>
+      </w:pPr>
+    </w:p>
+    <w:p>
+      <w:pPr>
+        <w:spacing w:line="240" w:lineRule="auto"/>
+        <w:rPr>
+          <w:rFonts w:cs="Arabic Typesetting"/>
+        </w:rPr>
+      </w:pPr>
+      <w:r>
+        <w:rPr>
+          <w:rFonts w:cs="Arabic Typesetting"/>
+        </w:rPr>
+        <w:t>https://github.com/confluentinc/schema-registry</w:t>
+      </w:r>
+    </w:p>
+    <w:p>
+      <w:pPr>
+        <w:spacing w:line="240" w:lineRule="auto"/>
+        <w:rPr>
+          <w:rFonts w:cs="Arabic Typesetting"/>
+        </w:rPr>
+      </w:pPr>
+    </w:p>
+    <w:p>
+      <w:pPr>
+        <w:spacing w:line="240" w:lineRule="auto"/>
+        <w:rPr>
+          <w:rFonts w:cs="Arabic Typesetting"/>
+        </w:rPr>
+      </w:pPr>
+      <w:r>
+        <w:rPr>
+          <w:rFonts w:cs="Arabic Typesetting"/>
+        </w:rPr>
+        <w:t>http://github.com/langchain-ai/langchain</w:t>
+      </w:r>
+    </w:p>
+    <w:p>
+      <w:pPr>
+        <w:spacing w:line="240" w:lineRule="auto"/>
+        <w:rPr>
+          <w:rFonts w:cs="Arabic Typesetting"/>
+        </w:rPr>
+      </w:pPr>
+    </w:p>
+    <w:p>
+      <w:pPr>
+        <w:spacing w:line="240" w:lineRule="auto"/>
+        <w:rPr>
+          <w:rFonts w:cs="Arabic Typesetting"/>
+        </w:rPr>
+      </w:pPr>
+      <w:r>
+        <w:rPr>
+          <w:rFonts w:cs="Arabic Typesetting"/>
+        </w:rPr>
+        <w:t>https://github.com/langchain-ai/langgraph</w:t>
+      </w:r>
+    </w:p>
+    <w:p>
+      <w:pPr>
+        <w:spacing w:line="240" w:lineRule="auto"/>
+        <w:rPr>
+          <w:rFonts w:cs="Arabic Typesetting"/>
+        </w:rPr>
+      </w:pPr>
+    </w:p>
+    <w:p>
+      <w:pPr>
+        <w:spacing w:line="240" w:lineRule="auto"/>
+        <w:rPr>
+          <w:rFonts w:cs="Arabic Typesetting"/>
+        </w:rPr>
+      </w:pPr>
+      <w:r>
+        <w:rPr>
+          <w:rFonts w:cs="Arabic Typesetting"/>
+        </w:rPr>
+        <w:t>https://github.com/TauricResearch/TradingAgents</w:t>
+      </w:r>
+    </w:p>
+    <w:p>
+      <w:pPr>
+        <w:spacing w:line="240" w:lineRule="auto"/>
+        <w:rPr>
+          <w:rFonts w:cs="Arabic Typesetting"/>
+        </w:rPr>
+      </w:pPr>
+    </w:p>
+    <w:p>
+      <w:pPr>
+        <w:spacing w:line="240" w:lineRule="auto"/>
+        <w:rPr>
+          <w:rFonts w:cs="Arabic Typesetting"/>
+        </w:rPr>
+      </w:pPr>
+      <w:r>
+        <w:rPr>
+          <w:rFonts w:cs="Arabic Typesetting"/>
+        </w:rPr>
+        <w:t>http://github.com/OpenBB-finance/OpenBB</w:t>
+      </w:r>
+    </w:p>
+    <w:p>
+      <w:pPr>
+        <w:spacing w:line="240" w:lineRule="auto"/>
+        <w:rPr>
+          <w:rFonts w:cs="Arabic Typesetting"/>
+        </w:rPr>
+      </w:pPr>
+    </w:p>
+    <w:p>
+      <w:pPr>
+        <w:spacing w:line="240" w:lineRule="auto"/>
+        <w:rPr>
+          <w:rFonts w:cs="Arabic Typesetting"/>
+        </w:rPr>
+      </w:pPr>
+      <w:r>
+        <w:rPr>
+          <w:rFonts w:cs="Arabic Typesetting"/>
+        </w:rPr>
+        <w:t>https://github.com/TA-Lib/ta-lib-python</w:t>
+      </w:r>
+    </w:p>
+    <w:p>
+      <w:pPr>
+        <w:spacing w:line="240" w:lineRule="auto"/>
+        <w:rPr>
+          <w:rFonts w:cs="Arabic Typesetting"/>
+        </w:rPr>
+      </w:pPr>
+    </w:p>
+    <w:p>
+      <w:pPr>
+        <w:spacing w:line="240" w:lineRule="auto"/>
+        <w:rPr>
+          <w:rFonts w:cs="Arabic Typesetting"/>
+        </w:rPr>
+      </w:pPr>
+      <w:r>
+        <w:rPr>
+          <w:rFonts w:cs="Arabic Typesetting"/>
+        </w:rPr>
+        <w:t>https://github.com/bukosabino/ta</w:t>
+      </w:r>
+    </w:p>
+    <w:p>
+      <w:pPr>
+        <w:spacing w:line="240" w:lineRule="auto"/>
+        <w:rPr>
+          <w:rFonts w:cs="Arabic Typesetting"/>
+        </w:rPr>
+      </w:pPr>
+    </w:p>
+    <w:p>
+      <w:pPr>
+        <w:spacing w:line="240" w:lineRule="auto"/>
+        <w:rPr>
+          <w:rFonts w:cs="Arabic Typesetting"/>
+        </w:rPr>
+      </w:pPr>
+      <w:r>
+        <w:rPr>
+          <w:rFonts w:cs="Arabic Typesetting"/>
+        </w:rPr>
+        <w:t>https://github.com/All-Hands-AI/OpenHands</w:t>
+      </w:r>
+    </w:p>
+    <w:p>
+      <w:pPr>
+        <w:spacing w:line="240" w:lineRule="auto"/>
+        <w:rPr>
+          <w:rFonts w:cs="Arabic Typesetting"/>
+        </w:rPr>
+      </w:pPr>
+    </w:p>
+    <w:p>
+      <w:pPr>
+        <w:spacing w:line="240" w:lineRule="auto"/>
+        <w:rPr>
+          <w:rFonts w:cs="Arabic Typesetting"/>
+        </w:rPr>
+      </w:pPr>
+      <w:r>
+        <w:rPr>
+          <w:rFonts w:cs="Arabic Typesetting"/>
+        </w:rPr>
+        <w:t>https://github.com/huseinzol05/Stock-Prediction-Models</w:t>
+      </w:r>
+    </w:p>
+    <w:p>
+      <w:pPr>
+        <w:spacing w:line="240" w:lineRule="auto"/>
+        <w:rPr>
+          <w:rFonts w:cs="Arabic Typesetting"/>
+        </w:rPr>
+      </w:pPr>
+    </w:p>
+    <w:p>
+      <w:pPr>
+        <w:spacing w:line="240" w:lineRule="auto"/>
+        <w:rPr>
+          <w:rFonts w:cs="Arabic Typesetting"/>
+        </w:rPr>
+      </w:pPr>
+      <w:r>
+        <w:rPr>
+          <w:rFonts w:cs="Arabic Typesetting"/>
+        </w:rPr>
+        <w:t>https://github.com/jaungiers/LSTM-Neural-Network-for-Time-Series-Prediction|</w:t>
+      </w:r>
+    </w:p>
+    <w:p>
+      <w:pPr>
+        <w:spacing w:line="240" w:lineRule="auto"/>
+        <w:rPr>
+          <w:rFonts w:cs="Arabic Typesetting"/>
+        </w:rPr>
+      </w:pPr>
+    </w:p>
+    <w:p>
+      <w:pPr>
+        <w:spacing w:line="240" w:lineRule="auto"/>
+        <w:rPr>
+          <w:rFonts w:cs="Arabic Typesetting"/>
+        </w:rPr>
+      </w:pPr>
+      <w:r>
+        <w:rPr>
+          <w:rFonts w:cs="Arabic Typesetting"/>
+        </w:rPr>
+        <w:t>https://github.com/victor369basu/Real-time-stock-market-prediction</w:t>
+      </w:r>
+    </w:p>
+    <w:p>
+      <w:pPr>
+        <w:spacing w:line="240" w:lineRule="auto"/>
+        <w:rPr>
+          <w:rFonts w:cs="Arabic Typesetting"/>
+        </w:rPr>
+      </w:pPr>
+    </w:p>
+    <w:p>
+      <w:pPr>
+        <w:spacing w:line="240" w:lineRule="auto"/>
+        <w:rPr>
+          <w:rFonts w:cs="Arabic Typesetting"/>
+        </w:rPr>
+      </w:pPr>
+      <w:r>
+        <w:rPr>
+          <w:rFonts w:cs="Arabic Typesetting"/>
+        </w:rPr>
+        <w:t>https://github.com/polakowo/vectorbt</w:t>
+      </w:r>
+    </w:p>
+    <w:p>
+      <w:pPr>
+        <w:spacing w:line="240" w:lineRule="auto"/>
+        <w:rPr>
+          <w:rFonts w:cs="Arabic Typesetting"/>
+        </w:rPr>
+      </w:pPr>
+    </w:p>
+    <w:p>
+      <w:pPr>
+        <w:spacing w:line="240" w:lineRule="auto"/>
+        <w:rPr>
+          <w:rFonts w:cs="Arabic Typesetting"/>
+        </w:rPr>
+      </w:pPr>
+      <w:r>
+        <w:rPr>
+          <w:rFonts w:cs="Arabic Typesetting"/>
+        </w:rPr>
+        <w:t>https://github.com/mementum/backtrader</w:t>
+      </w:r>
+    </w:p>
+    <w:p>
+      <w:pPr>
+        <w:spacing w:line="240" w:lineRule="auto"/>
+        <w:rPr>
+          <w:rFonts w:cs="Arabic Typesetting"/>
+        </w:rPr>
+      </w:pPr>
+    </w:p>
+    <w:p>
+      <w:pPr>
+        <w:spacing w:line="240" w:lineRule="auto"/>
+        <w:rPr>
+          <w:rFonts w:cs="Arabic Typesetting"/>
+        </w:rPr>
+      </w:pPr>
+      <w:r>
+        <w:rPr>
+          <w:rFonts w:cs="Arabic Typesetting"/>
+        </w:rPr>
+        <w:t>https://github.com/Yvictor/TradingGym</w:t>
+      </w:r>
+    </w:p>
+    <w:p>
+      <w:pPr>
+        <w:spacing w:line="240" w:lineRule="auto"/>
+        <w:rPr>
+          <w:rFonts w:cs="Arabic Typesetting"/>
+        </w:rPr>
+      </w:pPr>
+    </w:p>
+    <w:p>
+      <w:pPr>
+        <w:spacing w:line="240" w:lineRule="auto"/>
+        <w:rPr>
+          <w:rFonts w:cs="Arabic Typesetting"/>
+        </w:rPr>
+      </w:pPr>
+      <w:r>
+        <w:rPr>
+          <w:rFonts w:cs="Arabic Typesetting"/>
+        </w:rPr>
+        <w:t>https://github.com/lballabio/QuantLib</w:t>
+      </w:r>
+    </w:p>
+    <w:p>
+      <w:pPr>
+        <w:spacing w:line="240" w:lineRule="auto"/>
+        <w:rPr>
+          <w:rFonts w:cs="Arabic Typesetting"/>
+        </w:rPr>
+      </w:pPr>
+    </w:p>
+    <w:p>
+      <w:pPr>
+        <w:spacing w:line="240" w:lineRule="auto"/>
+        <w:rPr>
+          <w:rFonts w:cs="Arabic Typesetting"/>
+        </w:rPr>
+      </w:pPr>
+      <w:r>
+        <w:rPr>
+          <w:rFonts w:cs="Arabic Typesetting"/>
+        </w:rPr>
+        <w:t>https://github.com/vercel/next.js</w:t>
+      </w:r>
+    </w:p>
+    <w:p>
+      <w:pPr>
+        <w:spacing w:line="240" w:lineRule="auto"/>
+        <w:rPr>
+          <w:rFonts w:cs="Arabic Typesetting"/>
+        </w:rPr>
+      </w:pPr>
+    </w:p>
+    <w:p>
+      <w:pPr>
+        <w:spacing w:line="240" w:lineRule="auto"/>
+        <w:rPr>
+          <w:rFonts w:cs="Arabic Typesetting"/>
+        </w:rPr>
+      </w:pPr>
+      <w:r>
+        <w:rPr>
+          <w:rFonts w:cs="Arabic Typesetting"/>
+        </w:rPr>
+        <w:t>https://github.com/fastapi/fastapi</w:t>
+      </w:r>
+    </w:p>
+    <w:p>
+      <w:pPr>
+        <w:spacing w:line="240" w:lineRule="auto"/>
+        <w:rPr>
+          <w:rFonts w:cs="Arabic Typesetting"/>
+        </w:rPr>
+      </w:pPr>
+    </w:p>
+    <w:p>
+      <w:pPr>
+        <w:spacing w:line="240" w:lineRule="auto"/>
+        <w:rPr>
+          <w:rFonts w:cs="Arabic Typesetting"/>
+        </w:rPr>
+      </w:pPr>
+      <w:r>
+        <w:rPr>
+          <w:rFonts w:cs="Arabic Typesetting"/>
+        </w:rPr>
+        <w:t>https://github.com/grpc/grpc</w:t>
+      </w:r>
+    </w:p>
+    <w:p>
+      <w:pPr>
+        <w:spacing w:line="240" w:lineRule="auto"/>
+        <w:rPr>
+          <w:rFonts w:cs="Arabic Typesetting"/>
+        </w:rPr>
+      </w:pPr>
+    </w:p>
+    <w:p>
+      <w:pPr>
+        <w:spacing w:line="240" w:lineRule="auto"/>
+        <w:rPr>
+          <w:rFonts w:cs="Arabic Typesetting"/>
+        </w:rPr>
+      </w:pPr>
+      <w:r>
+        <w:rPr>
+          <w:rFonts w:cs="Arabic Typesetting"/>
+        </w:rPr>
+        <w:t>https://github.com/lobehub/lobe-chat</w:t>
+      </w:r>
+    </w:p>
+    <w:p>
+      <w:pPr>
+        <w:spacing w:line="240" w:lineRule="auto"/>
+        <w:rPr>
+          <w:rFonts w:cs="Arabic Typesetting"/>
+        </w:rPr>
+      </w:pPr>
+    </w:p>
+    <w:p>
+      <w:pPr>
+        <w:spacing w:line="240" w:lineRule="auto"/>
+        <w:rPr>
+          <w:rFonts w:cs="Arabic Typesetting"/>
+        </w:rPr>
+      </w:pPr>
+      <w:r>
+        <w:rPr>
+          <w:rFonts w:cs="Arabic Typesetting"/>
+        </w:rPr>
+        <w:t>https://github.com/infiniflow/ragflow</w:t>
+      </w:r>
+    </w:p>
+    <w:p>
+      <w:pPr>
+        <w:spacing w:line="240" w:lineRule="auto"/>
+        <w:rPr>
+          <w:rFonts w:cs="Arabic Typesetting"/>
+        </w:rPr>
+      </w:pPr>
+    </w:p>
+    <w:p>
+      <w:pPr>
+        <w:spacing w:line="240" w:lineRule="auto"/>
+        <w:rPr>
+          <w:rFonts w:cs="Arabic Typesetting"/>
+        </w:rPr>
+      </w:pPr>
+      <w:r>
+        <w:rPr>
+          <w:rFonts w:cs="Arabic Typesetting"/>
+        </w:rPr>
+        <w:t>https://github.com/pgvector/pgvector</w:t>
+      </w:r>
+    </w:p>
+    <w:p>
+      <w:pPr>
+        <w:spacing w:line="240" w:lineRule="auto"/>
+        <w:rPr>
+          <w:rFonts w:cs="Arabic Typesetting"/>
+        </w:rPr>
+      </w:pPr>
+    </w:p>
+    <w:p>
+      <w:pPr>
+        <w:spacing w:line="240" w:lineRule="auto"/>
+        <w:rPr>
+          <w:rFonts w:cs="Arabic Typesetting"/>
+        </w:rPr>
+      </w:pPr>
+      <w:r>
+        <w:rPr>
+          <w:rFonts w:cs="Arabic Typesetting"/>
+        </w:rPr>
+        <w:t>https://github.com/ClickHouse/ClickHouse</w:t>
+      </w:r>
+    </w:p>
+    <w:p>
+      <w:pPr>
+        <w:spacing w:line="240" w:lineRule="auto"/>
+        <w:rPr>
+          <w:rFonts w:cs="Arabic Typesetting"/>
+        </w:rPr>
+      </w:pPr>
+    </w:p>
+    <w:p>
+      <w:pPr>
+        <w:spacing w:line="240" w:lineRule="auto"/>
+        <w:rPr>
+          <w:rFonts w:cs="Arabic Typesetting"/>
+        </w:rPr>
+      </w:pPr>
+      <w:r>
+        <w:rPr>
+          <w:rFonts w:cs="Arabic Typesetting"/>
+        </w:rPr>
+        <w:t>http://github.com/duckdb/duckdb</w:t>
+      </w:r>
+    </w:p>
+    <w:p>
+      <w:pPr>
+        <w:spacing w:line="240" w:lineRule="auto"/>
+        <w:rPr>
+          <w:rFonts w:cs="Arabic Typesetting"/>
+        </w:rPr>
+      </w:pPr>
+    </w:p>
+    <w:p>
+      <w:pPr>
+        <w:spacing w:line="240" w:lineRule="auto"/>
+        <w:rPr>
+          <w:rFonts w:cs="Arabic Typesetting"/>
+        </w:rPr>
+      </w:pPr>
+      <w:r>
+        <w:rPr>
+          <w:rFonts w:cs="Arabic Typesetting"/>
+        </w:rPr>
+        <w:t>https://github.com/qdrant/qdrant</w:t>
+      </w:r>
+    </w:p>
+    <w:p>
+      <w:pPr>
+        <w:spacing w:line="240" w:lineRule="auto"/>
+        <w:rPr>
+          <w:rFonts w:cs="Arabic Typesetting"/>
+        </w:rPr>
+      </w:pPr>
+    </w:p>
+    <w:p>
+      <w:pPr>
+        <w:spacing w:line="240" w:lineRule="auto"/>
+        <w:rPr>
+          <w:rFonts w:cs="Arabic Typesetting"/>
+        </w:rPr>
+      </w:pPr>
+      <w:r>
+        <w:rPr>
+          <w:rFonts w:cs="Arabic Typesetting"/>
+        </w:rPr>
+        <w:t>https://github.com/apache/iceberg</w:t>
+      </w:r>
+    </w:p>
+    <w:p>
+      <w:pPr>
+        <w:spacing w:line="240" w:lineRule="auto"/>
+        <w:rPr>
+          <w:rFonts w:cs="Arabic Typesetting"/>
+        </w:rPr>
+      </w:pPr>
+    </w:p>
+    <w:p>
+      <w:pPr>
+        <w:spacing w:line="240" w:lineRule="auto"/>
+        <w:rPr>
+          <w:rFonts w:cs="Arabic Typesetting"/>
+        </w:rPr>
+      </w:pPr>
+      <w:r>
+        <w:rPr>
+          <w:rFonts w:cs="Arabic Typesetting"/>
+        </w:rPr>
+        <w:t>https://github.com/quickfix-j/quickfixj</w:t>
+      </w:r>
+    </w:p>
+    <w:p>
+      <w:pPr>
+        <w:spacing w:line="240" w:lineRule="auto"/>
+        <w:rPr>
+          <w:rFonts w:cs="Arabic Typesetting"/>
+        </w:rPr>
+      </w:pPr>
+    </w:p>
+    <w:p>
+      <w:pPr>
+        <w:spacing w:line="240" w:lineRule="auto"/>
+        <w:rPr>
+          <w:rFonts w:cs="Arabic Typesetting"/>
+        </w:rPr>
+      </w:pPr>
+      <w:r>
+        <w:rPr>
+          <w:rFonts w:cs="Arabic Typesetting"/>
+        </w:rPr>
+        <w:t>https://github.com/fix8/fix8</w:t>
+      </w:r>
+    </w:p>
+    <w:p>
+      <w:pPr>
+        <w:spacing w:line="240" w:lineRule="auto"/>
+        <w:rPr>
+          <w:rFonts w:cs="Arabic Typesetting"/>
+        </w:rPr>
+      </w:pPr>
+    </w:p>
+    <w:p>
+      <w:pPr>
+        <w:spacing w:line="240" w:lineRule="auto"/>
+        <w:rPr>
+          <w:rFonts w:cs="Arabic Typesetting"/>
+        </w:rPr>
+      </w:pPr>
+      <w:r>
+        <w:rPr>
+          <w:rFonts w:cs="Arabic Typesetting"/>
+        </w:rPr>
+        <w:t>https://github.com/feast-dev/feast</w:t>
+      </w:r>
+    </w:p>
+    <w:p>
+      <w:pPr>
+        <w:spacing w:line="240" w:lineRule="auto"/>
+        <w:rPr>
+          <w:rFonts w:cs="Arabic Typesetting"/>
+        </w:rPr>
+      </w:pPr>
+    </w:p>
+    <w:p>
+      <w:pPr>
+        <w:spacing w:line="240" w:lineRule="auto"/>
+        <w:rPr>
+          <w:rFonts w:cs="Arabic Typesetting"/>
+        </w:rPr>
+      </w:pPr>
+      <w:r>
+        <w:rPr>
+          <w:rFonts w:cs="Arabic Typesetting"/>
+        </w:rPr>
+        <w:t>https://github.com/tecton-ai</w:t>
+      </w:r>
+    </w:p>
+    <w:p>
+      <w:pPr>
+        <w:spacing w:line="240" w:lineRule="auto"/>
+        <w:rPr>
+          <w:rFonts w:cs="Arabic Typesetting"/>
+        </w:rPr>
+      </w:pPr>
+    </w:p>
+    <w:p>
+      <w:pPr>
+        <w:spacing w:line="240" w:lineRule="auto"/>
+        <w:rPr>
+          <w:rFonts w:cs="Arabic Typesetting"/>
+        </w:rPr>
+      </w:pPr>
+      <w:r>
+        <w:rPr>
+          <w:rFonts w:cs="Arabic Typesetting"/>
+        </w:rPr>
+        <w:t>https://github.com/prometheus/prometheus</w:t>
+      </w:r>
+    </w:p>
+    <w:p>
+      <w:pPr>
+        <w:spacing w:line="240" w:lineRule="auto"/>
+        <w:rPr>
+          <w:rFonts w:cs="Arabic Typesetting"/>
+        </w:rPr>
+      </w:pPr>
+    </w:p>
+    <w:p>
+      <w:pPr>
+        <w:spacing w:line="240" w:lineRule="auto"/>
+        <w:rPr>
+          <w:rFonts w:cs="Arabic Typesetting"/>
+        </w:rPr>
+      </w:pPr>
+      <w:r>
+        <w:rPr>
+          <w:rFonts w:cs="Arabic Typesetting"/>
+        </w:rPr>
+        <w:t>https://github.com/grafana/grafana</w:t>
+      </w:r>
+    </w:p>
+    <w:p>
+      <w:pPr>
+        <w:spacing w:line="240" w:lineRule="auto"/>
+        <w:rPr>
+          <w:rFonts w:cs="Arabic Typesetting"/>
+        </w:rPr>
+      </w:pPr>
+    </w:p>
+    <w:p>
+      <w:pPr>
+        <w:spacing w:line="240" w:lineRule="auto"/>
+        <w:rPr>
+          <w:rFonts w:cs="Arabic Typesetting"/>
+        </w:rPr>
+      </w:pPr>
+      <w:r>
+        <w:rPr>
+          <w:rFonts w:cs="Arabic Typesetting"/>
+        </w:rPr>
+        <w:t>https://github.com/grafana/tempo</w:t>
+      </w:r>
+    </w:p>
+    <w:p>
+      <w:pPr>
+        <w:spacing w:line="240" w:lineRule="auto"/>
+        <w:rPr>
+          <w:rFonts w:cs="Arabic Typesetting"/>
+        </w:rPr>
+      </w:pPr>
+    </w:p>
+    <w:p>
+      <w:pPr>
+        <w:spacing w:line="240" w:lineRule="auto"/>
+        <w:rPr>
+          <w:rFonts w:cs="Arabic Typesetting"/>
+        </w:rPr>
+      </w:pPr>
+      <w:r>
+        <w:rPr>
+          <w:rFonts w:cs="Arabic Typesetting"/>
+        </w:rPr>
+        <w:t>https://github.com/bloomberg/memray</w:t>
+      </w:r>
+    </w:p>
+    <w:p>
+      <w:pPr>
+        <w:spacing w:line="240" w:lineRule="auto"/>
+        <w:rPr>
+          <w:rFonts w:cs="Arabic Typesetting"/>
+        </w:rPr>
+      </w:pPr>
+    </w:p>
+    <w:p>
+      <w:pPr>
+        <w:spacing w:line="240" w:lineRule="auto"/>
+        <w:rPr>
+          <w:rFonts w:cs="Arabic Typesetting"/>
+        </w:rPr>
+      </w:pPr>
+      <w:r>
+        <w:rPr>
+          <w:rFonts w:cs="Arabic Typesetting"/>
+        </w:rPr>
+        <w:t>https://github.com/Unleash/unleash</w:t>
+      </w:r>
+    </w:p>
+    <w:p>
+      <w:pPr>
+        <w:spacing w:line="240" w:lineRule="auto"/>
+        <w:rPr>
+          <w:rFonts w:cs="Arabic Typesetting"/>
+        </w:rPr>
+      </w:pPr>
+    </w:p>
+    <w:p>
+      <w:pPr>
+        <w:spacing w:line="240" w:lineRule="auto"/>
+        <w:rPr>
+          <w:rFonts w:cs="Arabic Typesetting"/>
+        </w:rPr>
+      </w:pPr>
+      <w:r>
+        <w:rPr>
+          <w:rFonts w:cs="Arabic Typesetting"/>
+        </w:rPr>
+        <w:t>https://github.com/PyCQA/bandit</w:t>
+      </w:r>
+    </w:p>
+    <w:p>
+      <w:pPr>
+        <w:spacing w:line="240" w:lineRule="auto"/>
+        <w:rPr>
+          <w:rFonts w:cs="Arabic Typesetting"/>
+        </w:rPr>
+      </w:pPr>
+    </w:p>
+    <w:p>
+      <w:pPr>
+        <w:spacing w:line="240" w:lineRule="auto"/>
+        <w:rPr>
+          <w:rFonts w:cs="Arabic Typesetting"/>
+        </w:rPr>
+      </w:pPr>
+      <w:r>
+        <w:rPr>
+          <w:rFonts w:cs="Arabic Typesetting"/>
+        </w:rPr>
+        <w:t>https://github.com/react-financial/react-financial-charts</w:t>
+      </w:r>
+    </w:p>
+    <w:p>
+      <w:pPr>
+        <w:spacing w:line="240" w:lineRule="auto"/>
+        <w:rPr>
+          <w:rFonts w:cs="Arabic Typesetting"/>
+        </w:rPr>
+      </w:pPr>
+    </w:p>
+    <w:p>
+      <w:pPr>
+        <w:spacing w:line="240" w:lineRule="auto"/>
+        <w:rPr>
+          <w:rFonts w:cs="Arabic Typesetting"/>
+        </w:rPr>
+      </w:pPr>
+      <w:r>
+        <w:rPr>
+          <w:rFonts w:cs="Arabic Typesetting"/>
+        </w:rPr>
+        <w:t>https://github.com/plotly/dash</w:t>
+      </w:r>
+    </w:p>
+    <w:p>
+      <w:pPr>
+        <w:spacing w:line="240" w:lineRule="auto"/>
+        <w:rPr>
+          <w:rFonts w:cs="Arabic Typesetting"/>
+        </w:rPr>
+      </w:pPr>
+    </w:p>
+    <w:p>
+      <w:pPr>
+        <w:spacing w:line="240" w:lineRule="auto"/>
+        <w:rPr>
+          <w:rFonts w:cs="Arabic Typesetting"/>
+        </w:rPr>
+      </w:pPr>
+      <w:r>
+        <w:rPr>
+          <w:rFonts w:cs="Arabic Typesetting"/>
+        </w:rPr>
+        <w:t>https://github.com/optuna/optuna</w:t>
+      </w:r>
+    </w:p>
+    <w:p>
+      <w:pPr>
+        <w:spacing w:line="240" w:lineRule="auto"/>
+        <w:rPr>
+          <w:rFonts w:cs="Arabic Typesetting"/>
+        </w:rPr>
+      </w:pPr>
+    </w:p>
+    <w:p>
+      <w:pPr>
+        <w:spacing w:line="240" w:lineRule="auto"/>
+        <w:rPr>
+          <w:rFonts w:cs="Arabic Typesetting"/>
+        </w:rPr>
+      </w:pPr>
+      <w:r>
+        <w:rPr>
+          <w:rFonts w:cs="Arabic Typesetting"/>
+        </w:rPr>
+        <w:t>https://github.com/robertmartin8/PyPortfolioOpt</w:t>
+      </w:r>
+    </w:p>
+    <w:p>
+      <w:pPr>
+        <w:spacing w:line="240" w:lineRule="auto"/>
+        <w:rPr>
+          <w:rFonts w:cs="Arabic Typesetting"/>
+        </w:rPr>
+      </w:pPr>
+    </w:p>
+    <w:p>
+      <w:pPr>
+        <w:spacing w:line="240" w:lineRule="auto"/>
+        <w:rPr>
+          <w:rFonts w:cs="Arabic Typesetting"/>
+        </w:rPr>
+      </w:pPr>
+      <w:r>
+        <w:rPr>
+          <w:rFonts w:cs="Arabic Typesetting"/>
+        </w:rPr>
+        <w:t>https://github.com/dcajasn/Riskfolio-Lib</w:t>
+      </w:r>
+    </w:p>
+    <w:p>
+      <w:pPr>
+        <w:spacing w:line="240" w:lineRule="auto"/>
+        <w:rPr>
+          <w:rFonts w:cs="Arabic Typesetting"/>
+        </w:rPr>
+      </w:pPr>
+    </w:p>
+    <w:p>
+      <w:pPr>
+        <w:spacing w:line="240" w:lineRule="auto"/>
+        <w:rPr>
+          <w:rFonts w:cs="Arabic Typesetting"/>
+        </w:rPr>
+      </w:pPr>
+      <w:r>
+        <w:rPr>
+          <w:rFonts w:cs="Arabic Typesetting"/>
+        </w:rPr>
+        <w:t>https://github.com/yzhao062/pyod</w:t>
+      </w:r>
+    </w:p>
+    <w:p>
+      <w:pPr>
+        <w:spacing w:line="240" w:lineRule="auto"/>
+        <w:rPr>
+          <w:rFonts w:cs="Arabic Typesetting"/>
+        </w:rPr>
+      </w:pPr>
+    </w:p>
+    <w:p>
+      <w:pPr>
+        <w:spacing w:line="240" w:lineRule="auto"/>
+        <w:rPr>
+          <w:rFonts w:cs="Arabic Typesetting"/>
+        </w:rPr>
+      </w:pPr>
+      <w:r>
+        <w:rPr>
+          <w:rFonts w:cs="Arabic Typesetting"/>
+        </w:rPr>
+        <w:t>https://github.com/shap/shap</w:t>
+      </w:r>
+    </w:p>
+    <w:p>
+      <w:pPr>
+        <w:spacing w:line="240" w:lineRule="auto"/>
+        <w:rPr>
+          <w:rFonts w:cs="Arabic Typesetting"/>
+        </w:rPr>
+      </w:pPr>
+    </w:p>
+    <w:p>
+      <w:pPr>
+        <w:spacing w:line="240" w:lineRule="auto"/>
+        <w:rPr>
+          <w:rFonts w:cs="Arabic Typesetting"/>
+        </w:rPr>
+      </w:pPr>
+      <w:r>
+        <w:rPr>
+          <w:rFonts w:cs="Arabic Typesetting"/>
+        </w:rPr>
+        <w:t>https://github.com/google/blockly</w:t>
+      </w:r>
+    </w:p>
+    <w:p>
+      <w:pPr>
+        <w:spacing w:line="240" w:lineRule="auto"/>
+        <w:rPr>
+          <w:rFonts w:cs="Arabic Typesetting"/>
+        </w:rPr>
+      </w:pPr>
+    </w:p>
+    <w:p>
+      <w:pPr>
+        <w:spacing w:line="240" w:lineRule="auto"/>
+        <w:rPr>
+          <w:rFonts w:cs="Arabic Typesetting"/>
+        </w:rPr>
+      </w:pPr>
+      <w:r>
+        <w:rPr>
+          <w:rFonts w:cs="Arabic Typesetting"/>
+        </w:rPr>
+        <w:t>https://github.com/huggingface/transformers</w:t>
+      </w:r>
+    </w:p>
+    <w:p>
+      <w:pPr>
+        <w:spacing w:line="240" w:lineRule="auto"/>
+        <w:rPr>
+          <w:rFonts w:cs="Arabic Typesetting"/>
+        </w:rPr>
+      </w:pPr>
+    </w:p>
+    <w:p>
+      <w:pPr>
+        <w:spacing w:line="240" w:lineRule="auto"/>
+        <w:rPr>
+          <w:rFonts w:cs="Arabic Typesetting"/>
+        </w:rPr>
+      </w:pPr>
+      <w:r>
+        <w:rPr>
+          <w:rFonts w:cs="Arabic Typesetting"/>
+        </w:rPr>
+        <w:t>https://github.com/pytorch/pytorch</w:t>
+      </w:r>
+    </w:p>
+    <w:p>
+      <w:pPr>
+        <w:spacing w:line="240" w:lineRule="auto"/>
+        <w:rPr>
+          <w:rFonts w:cs="Arabic Typesetting"/>
+        </w:rPr>
+      </w:pPr>
+    </w:p>
+    <w:p>
+      <w:pPr>
+        <w:spacing w:line="240" w:lineRule="auto"/>
+        <w:rPr>
+          <w:rFonts w:cs="Arabic Typesetting"/>
+        </w:rPr>
+      </w:pPr>
+      <w:r>
+        <w:rPr>
+          <w:rFonts w:cs="Arabic Typesetting"/>
+        </w:rPr>
+        <w:t>https://github.com/AI4Finance-Foundation/FinRL</w:t>
+      </w:r>
+    </w:p>
+    <w:p>
+      <w:pPr>
+        <w:spacing w:line="240" w:lineRule="auto"/>
+        <w:rPr>
+          <w:rFonts w:cs="Arabic Typesetting"/>
+        </w:rPr>
+      </w:pPr>
+    </w:p>
+    <w:p>
+      <w:pPr>
+        <w:spacing w:line="240" w:lineRule="auto"/>
+        <w:rPr>
+          <w:rFonts w:cs="Arabic Typesetting"/>
           <w:b/>
           <w:bCs/>
         </w:rPr>
@@ -20856,21 +21850,12 @@
         <w:t>/</w:t>
       </w:r>
       <w:proofErr w:type="spellStart"/>
-      <w:proofErr w:type="gramStart"/>
-      <w:r>
-        <w:rPr>
-          <w:rFonts w:cs="Arabic Typesetting"/>
-          <w:color w:val="0000FF"/>
-        </w:rPr>
-        <w:t>nautilus</w:t>
-      </w:r>
-      <w:proofErr w:type="gramEnd"/>
-      <w:r>
-        <w:rPr>
-          <w:rFonts w:cs="Arabic Typesetting"/>
-          <w:color w:val="0000FF"/>
-        </w:rPr>
-        <w:t>_trader_engine</w:t>
+      <w:r>
+        <w:rPr>
+          <w:rFonts w:cs="Arabic Typesetting"/>
+          <w:color w:val="0000FF"/>
+        </w:rPr>
+        <w:t>nautilus_trader_engine</w:t>
       </w:r>
       <w:proofErr w:type="spellEnd"/>
       <w:r>
@@ -20921,21 +21906,12 @@
         <w:t>/</w:t>
       </w:r>
       <w:proofErr w:type="spellStart"/>
-      <w:proofErr w:type="gramStart"/>
-      <w:r>
-        <w:rPr>
-          <w:rFonts w:cs="Arabic Typesetting"/>
-          <w:color w:val="0000FF"/>
-        </w:rPr>
-        <w:t>ai</w:t>
-      </w:r>
-      <w:proofErr w:type="gramEnd"/>
-      <w:r>
-        <w:rPr>
-          <w:rFonts w:cs="Arabic Typesetting"/>
-          <w:color w:val="0000FF"/>
-        </w:rPr>
-        <w:t>_assistant</w:t>
+      <w:r>
+        <w:rPr>
+          <w:rFonts w:cs="Arabic Typesetting"/>
+          <w:color w:val="0000FF"/>
+        </w:rPr>
+        <w:t>ai_assistant</w:t>
       </w:r>
       <w:proofErr w:type="spellEnd"/>
       <w:r>
@@ -20967,23 +21943,7 @@
           <w:rFonts w:cs="Arabic Typesetting"/>
           <w:color w:val="0000FF"/>
         </w:rPr>
-        <w:t>/</w:t>
-      </w:r>
-      <w:proofErr w:type="gramStart"/>
-      <w:r>
-        <w:rPr>
-          <w:rFonts w:cs="Arabic Typesetting"/>
-          <w:color w:val="0000FF"/>
-        </w:rPr>
-        <w:t>frontend</w:t>
-      </w:r>
-      <w:proofErr w:type="gramEnd"/>
-      <w:r>
-        <w:rPr>
-          <w:rFonts w:cs="Arabic Typesetting"/>
-          <w:color w:val="0000FF"/>
-        </w:rPr>
-        <w:t>: Next.js-based user interface.</w:t>
+        <w:t>/frontend: Next.js-based user interface.</w:t>
       </w:r>
     </w:p>
     <w:p>
@@ -22728,23 +23688,7 @@
           <w:rFonts w:cs="Arabic Typesetting"/>
           <w:color w:val="0000FF"/>
         </w:rPr>
-        <w:t>Stock Futures &amp; Index Futures (e.g., E-</w:t>
-      </w:r>
-      <w:proofErr w:type="gramStart"/>
-      <w:r>
-        <w:rPr>
-          <w:rFonts w:cs="Arabic Typesetting"/>
-          <w:color w:val="0000FF"/>
-        </w:rPr>
-        <w:t>mini S</w:t>
-      </w:r>
-      <w:proofErr w:type="gramEnd"/>
-      <w:r>
-        <w:rPr>
-          <w:rFonts w:cs="Arabic Typesetting"/>
-          <w:color w:val="0000FF"/>
-        </w:rPr>
-        <w:t>&amp;P 500, Nasdaq-100).</w:t>
+        <w:t>Stock Futures &amp; Index Futures (e.g., E-mini S&amp;P 500, Nasdaq-100).</w:t>
       </w:r>
     </w:p>
     <w:p>
@@ -23375,23 +24319,7 @@
           <w:rFonts w:cs="Arabic Typesetting"/>
           <w:color w:val="0000FF"/>
         </w:rPr>
-        <w:t>: Free delayed data for equity index futures (e.g., E-</w:t>
-      </w:r>
-      <w:proofErr w:type="gramStart"/>
-      <w:r>
-        <w:rPr>
-          <w:rFonts w:cs="Arabic Typesetting"/>
-          <w:color w:val="0000FF"/>
-        </w:rPr>
-        <w:t>mini S</w:t>
-      </w:r>
-      <w:proofErr w:type="gramEnd"/>
-      <w:r>
-        <w:rPr>
-          <w:rFonts w:cs="Arabic Typesetting"/>
-          <w:color w:val="0000FF"/>
-        </w:rPr>
-        <w:t>&amp;P 500).</w:t>
+        <w:t>: Free delayed data for equity index futures (e.g., E-mini S&amp;P 500).</w:t>
       </w:r>
     </w:p>
     <w:p>
@@ -28863,23 +29791,7 @@
           <w:rFonts w:cs="Arabic Typesetting"/>
           <w:color w:val="0000FF"/>
         </w:rPr>
-        <w:t xml:space="preserve"> and </w:t>
-      </w:r>
-      <w:proofErr w:type="gramStart"/>
-      <w:r>
-        <w:rPr>
-          <w:rFonts w:cs="Arabic Typesetting"/>
-          <w:color w:val="0000FF"/>
-        </w:rPr>
-        <w:t>Supports</w:t>
-      </w:r>
-      <w:proofErr w:type="gramEnd"/>
-      <w:r>
-        <w:rPr>
-          <w:rFonts w:cs="Arabic Typesetting"/>
-          <w:color w:val="0000FF"/>
-        </w:rPr>
-        <w:t xml:space="preserve"> high-frequency trading needs.</w:t>
+        <w:t xml:space="preserve"> and Supports high-frequency trading needs.</w:t>
       </w:r>
     </w:p>
     <w:p>
@@ -44605,21 +45517,7 @@
         <w:rPr>
           <w:rFonts w:cs="Arabic Typesetting"/>
         </w:rPr>
-        <w:t xml:space="preserve">Ensure that each and every feature, task and sub tasks are properly </w:t>
-      </w:r>
-      <w:proofErr w:type="gramStart"/>
-      <w:r>
-        <w:rPr>
-          <w:rFonts w:cs="Arabic Typesetting"/>
-        </w:rPr>
-        <w:t>documented</w:t>
-      </w:r>
-      <w:proofErr w:type="gramEnd"/>
-      <w:r>
-        <w:rPr>
-          <w:rFonts w:cs="Arabic Typesetting"/>
-        </w:rPr>
-        <w:t xml:space="preserve"> and guides prepared.</w:t>
+        <w:t>Ensure that each and every feature, task and sub tasks are properly documented and guides prepared.</w:t>
       </w:r>
     </w:p>
     <w:p>

</xml_diff>

<commit_message>
Phase 1 - Completed, Tested, and Validated
</commit_message>
<xml_diff>
--- a/Other Files/Features, Phases & Integration Strategy - Algorithmic Trading System.docx
+++ b/Other Files/Features, Phases & Integration Strategy - Algorithmic Trading System.docx
@@ -40132,12 +40132,14 @@
         <w:rPr>
           <w:b/>
           <w:bCs/>
-        </w:rPr>
-      </w:pPr>
-      <w:r>
-        <w:rPr>
-          <w:b/>
-          <w:bCs/>
+          <w:color w:val="3333FF"/>
+        </w:rPr>
+      </w:pPr>
+      <w:r>
+        <w:rPr>
+          <w:b/>
+          <w:bCs/>
+          <w:color w:val="3333FF"/>
         </w:rPr>
         <w:t>Phase 1: Immediate Priority - Core System Validation &amp; Hardening Prompt</w:t>
       </w:r>
@@ -40149,15 +40151,22 @@
           <w:numId w:val="56"/>
         </w:numPr>
         <w:spacing w:line="240" w:lineRule="auto"/>
-      </w:pPr>
-      <w:r>
-        <w:rPr>
-          <w:b/>
-          <w:bCs/>
+        <w:rPr>
+          <w:color w:val="3333FF"/>
+        </w:rPr>
+      </w:pPr>
+      <w:r>
+        <w:rPr>
+          <w:b/>
+          <w:bCs/>
+          <w:color w:val="3333FF"/>
         </w:rPr>
         <w:t>Objective:</w:t>
       </w:r>
       <w:r>
+        <w:rPr>
+          <w:color w:val="3333FF"/>
+        </w:rPr>
         <w:t xml:space="preserve"> </w:t>
       </w:r>
     </w:p>
@@ -40168,80 +40177,140 @@
           <w:numId w:val="56"/>
         </w:numPr>
         <w:spacing w:line="240" w:lineRule="auto"/>
-      </w:pPr>
-      <w:r>
+        <w:rPr>
+          <w:color w:val="3333FF"/>
+        </w:rPr>
+      </w:pPr>
+      <w:r>
+        <w:rPr>
+          <w:color w:val="3333FF"/>
+        </w:rPr>
         <w:t xml:space="preserve">To validate and harden the foundational core system of the algorithmic trading platform, ensuring seamless integration of the </w:t>
       </w:r>
       <w:proofErr w:type="spellStart"/>
       <w:r>
+        <w:rPr>
+          <w:color w:val="3333FF"/>
+        </w:rPr>
         <w:t>NautilusTrader</w:t>
       </w:r>
       <w:proofErr w:type="spellEnd"/>
       <w:r>
+        <w:rPr>
+          <w:color w:val="3333FF"/>
+        </w:rPr>
         <w:t xml:space="preserve"> trading engine with Interactive Brokers (IBKR) for paper trading, implementation of multi-source data feeds with fallback mechanisms, custom volume-weighted technical indicators, comprehensive API interfaces, database configurations, Apache Kafka event bus with hierarchical topics and Schema Registry, enterprise-grade security measures (including zero-trust architecture, RBAC, MFA, encryption, SAST with Bandit, and STRIDE threat </w:t>
       </w:r>
       <w:proofErr w:type="spellStart"/>
       <w:r>
+        <w:rPr>
+          <w:color w:val="3333FF"/>
+        </w:rPr>
         <w:t>modeling</w:t>
       </w:r>
       <w:proofErr w:type="spellEnd"/>
       <w:r>
+        <w:rPr>
+          <w:color w:val="3333FF"/>
+        </w:rPr>
         <w:t xml:space="preserve">), and a formalized backup strategy. This phase focuses on achieving research-to-production parity, high performance (microsecond-level latency), resilience (fault isolation, self-healing prep), and observability, while supporting multi-asset classes (stocks, ETFs, futures, options, forex, commodities, crypto) and preparing for live trading transitions. It incorporates custom features like 30+ volume-weighted indicators (e.g., VW SMA, VW EMA, VW MACD, Normalized ATR, Choppy Market Index, Buy/Sell Easier Day) built with TA-Lib/ta-lib-python &amp; </w:t>
       </w:r>
       <w:proofErr w:type="spellStart"/>
       <w:r>
+        <w:rPr>
+          <w:color w:val="3333FF"/>
+        </w:rPr>
         <w:t>Bukosabino</w:t>
       </w:r>
       <w:proofErr w:type="spellEnd"/>
       <w:r>
+        <w:rPr>
+          <w:color w:val="3333FF"/>
+        </w:rPr>
         <w:t xml:space="preserve">/ta and NumPy, fully integrated into </w:t>
       </w:r>
       <w:proofErr w:type="spellStart"/>
       <w:r>
+        <w:rPr>
+          <w:color w:val="3333FF"/>
+        </w:rPr>
         <w:t>NautilusTrader</w:t>
       </w:r>
       <w:proofErr w:type="spellEnd"/>
       <w:r>
+        <w:rPr>
+          <w:color w:val="3333FF"/>
+        </w:rPr>
         <w:t xml:space="preserve"> for strategy development, </w:t>
       </w:r>
       <w:proofErr w:type="spellStart"/>
       <w:r>
+        <w:rPr>
+          <w:color w:val="3333FF"/>
+        </w:rPr>
         <w:t>backtesting</w:t>
       </w:r>
       <w:proofErr w:type="spellEnd"/>
       <w:r>
+        <w:rPr>
+          <w:color w:val="3333FF"/>
+        </w:rPr>
         <w:t xml:space="preserve">, and analysis. The hardening ensures compliance with regulations (e.g., MiFID II, SOX, GDPR) through immutable event logging and audit readiness, aligning with the "Best-of-Breed" philosophy, microservices decomposition, event-driven architecture (async communication, event sourcing, CQRS), cloud-native design (container-first, Kubernetes prep, 12-Factor App, </w:t>
       </w:r>
       <w:proofErr w:type="spellStart"/>
       <w:r>
+        <w:rPr>
+          <w:color w:val="3333FF"/>
+        </w:rPr>
         <w:t>IaC</w:t>
       </w:r>
       <w:proofErr w:type="spellEnd"/>
       <w:r>
+        <w:rPr>
+          <w:color w:val="3333FF"/>
+        </w:rPr>
         <w:t xml:space="preserve">), and API-first principles (REST, </w:t>
       </w:r>
       <w:proofErr w:type="spellStart"/>
       <w:r>
+        <w:rPr>
+          <w:color w:val="3333FF"/>
+        </w:rPr>
         <w:t>GraphQL</w:t>
       </w:r>
       <w:proofErr w:type="spellEnd"/>
       <w:r>
+        <w:rPr>
+          <w:color w:val="3333FF"/>
+        </w:rPr>
         <w:t xml:space="preserve">, WebSocket, </w:t>
       </w:r>
       <w:proofErr w:type="spellStart"/>
       <w:r>
+        <w:rPr>
+          <w:color w:val="3333FF"/>
+        </w:rPr>
         <w:t>gRPC</w:t>
       </w:r>
       <w:proofErr w:type="spellEnd"/>
       <w:r>
+        <w:rPr>
+          <w:color w:val="3333FF"/>
+        </w:rPr>
         <w:t xml:space="preserve">). This phase builds on Phase 0's dependency management, validating forked components (e.g., </w:t>
       </w:r>
       <w:proofErr w:type="spellStart"/>
       <w:r>
+        <w:rPr>
+          <w:color w:val="3333FF"/>
+        </w:rPr>
         <w:t>NautilusTrader</w:t>
       </w:r>
       <w:proofErr w:type="spellEnd"/>
       <w:r>
+        <w:rPr>
+          <w:color w:val="3333FF"/>
+        </w:rPr>
         <w:t xml:space="preserve"> in Tier 1) in isolated environments.</w:t>
       </w:r>
     </w:p>
@@ -40252,15 +40321,22 @@
           <w:numId w:val="56"/>
         </w:numPr>
         <w:spacing w:line="240" w:lineRule="auto"/>
-      </w:pPr>
-      <w:r>
-        <w:rPr>
-          <w:b/>
-          <w:bCs/>
+        <w:rPr>
+          <w:color w:val="3333FF"/>
+        </w:rPr>
+      </w:pPr>
+      <w:r>
+        <w:rPr>
+          <w:b/>
+          <w:bCs/>
+          <w:color w:val="3333FF"/>
         </w:rPr>
         <w:t>Key Tasks:</w:t>
       </w:r>
       <w:r>
+        <w:rPr>
+          <w:color w:val="3333FF"/>
+        </w:rPr>
         <w:t xml:space="preserve"> </w:t>
       </w:r>
     </w:p>
@@ -40271,11 +40347,15 @@
           <w:numId w:val="56"/>
         </w:numPr>
         <w:spacing w:line="240" w:lineRule="auto"/>
-      </w:pPr>
-      <w:r>
-        <w:rPr>
-          <w:b/>
-          <w:bCs/>
+        <w:rPr>
+          <w:color w:val="3333FF"/>
+        </w:rPr>
+      </w:pPr>
+      <w:r>
+        <w:rPr>
+          <w:b/>
+          <w:bCs/>
+          <w:color w:val="3333FF"/>
         </w:rPr>
         <w:t xml:space="preserve">Configure </w:t>
       </w:r>
@@ -40284,6 +40364,7 @@
         <w:rPr>
           <w:b/>
           <w:bCs/>
+          <w:color w:val="3333FF"/>
         </w:rPr>
         <w:t>NautilusTrader</w:t>
       </w:r>
@@ -40292,10 +40373,14 @@
         <w:rPr>
           <w:b/>
           <w:bCs/>
+          <w:color w:val="3333FF"/>
         </w:rPr>
         <w:t xml:space="preserve"> for Paper Trading Integration:</w:t>
       </w:r>
       <w:r>
+        <w:rPr>
+          <w:color w:val="3333FF"/>
+        </w:rPr>
         <w:t xml:space="preserve"> </w:t>
       </w:r>
     </w:p>
@@ -40306,16 +40391,28 @@
           <w:numId w:val="56"/>
         </w:numPr>
         <w:spacing w:line="240" w:lineRule="auto"/>
-      </w:pPr>
-      <w:r>
+        <w:rPr>
+          <w:color w:val="3333FF"/>
+        </w:rPr>
+      </w:pPr>
+      <w:r>
+        <w:rPr>
+          <w:color w:val="3333FF"/>
+        </w:rPr>
         <w:t xml:space="preserve">Integrate </w:t>
       </w:r>
       <w:proofErr w:type="spellStart"/>
       <w:r>
+        <w:rPr>
+          <w:color w:val="3333FF"/>
+        </w:rPr>
         <w:t>NautilusTrader's</w:t>
       </w:r>
       <w:proofErr w:type="spellEnd"/>
       <w:r>
+        <w:rPr>
+          <w:color w:val="3333FF"/>
+        </w:rPr>
         <w:t xml:space="preserve"> pre-built IBKR adapter to connect to a paper trading account, supporting multi-asset classes with order routing, execution, position management, and trade settlement.</w:t>
       </w:r>
     </w:p>
@@ -40326,16 +40423,28 @@
           <w:numId w:val="56"/>
         </w:numPr>
         <w:spacing w:line="240" w:lineRule="auto"/>
-      </w:pPr>
-      <w:r>
+        <w:rPr>
+          <w:color w:val="3333FF"/>
+        </w:rPr>
+      </w:pPr>
+      <w:r>
+        <w:rPr>
+          <w:color w:val="3333FF"/>
+        </w:rPr>
         <w:t xml:space="preserve">Implement seamless switching between paper and live modes in a prototype interface (e.g., basic Next.js dashboard), ensuring compliance with broker requirements (e.g., API keys, authentication tokens managed via </w:t>
       </w:r>
       <w:proofErr w:type="spellStart"/>
       <w:r>
+        <w:rPr>
+          <w:color w:val="3333FF"/>
+        </w:rPr>
         <w:t>HashiCorp</w:t>
       </w:r>
       <w:proofErr w:type="spellEnd"/>
       <w:r>
+        <w:rPr>
+          <w:color w:val="3333FF"/>
+        </w:rPr>
         <w:t xml:space="preserve"> Vault).</w:t>
       </w:r>
     </w:p>
@@ -40346,24 +40455,42 @@
           <w:numId w:val="56"/>
         </w:numPr>
         <w:spacing w:line="240" w:lineRule="auto"/>
-      </w:pPr>
-      <w:r>
+        <w:rPr>
+          <w:color w:val="3333FF"/>
+        </w:rPr>
+      </w:pPr>
+      <w:r>
+        <w:rPr>
+          <w:color w:val="3333FF"/>
+        </w:rPr>
         <w:t xml:space="preserve">Validate end-to-end pipeline: Fetch data, run a simple pre-built algorithm from </w:t>
       </w:r>
       <w:proofErr w:type="spellStart"/>
       <w:r>
+        <w:rPr>
+          <w:color w:val="3333FF"/>
+        </w:rPr>
         <w:t>NautilusTrader</w:t>
       </w:r>
       <w:proofErr w:type="spellEnd"/>
       <w:r>
+        <w:rPr>
+          <w:color w:val="3333FF"/>
+        </w:rPr>
         <w:t xml:space="preserve"> library, generate results, and log events to Kafka for </w:t>
       </w:r>
       <w:proofErr w:type="spellStart"/>
       <w:r>
+        <w:rPr>
+          <w:color w:val="3333FF"/>
+        </w:rPr>
         <w:t>replayability</w:t>
       </w:r>
       <w:proofErr w:type="spellEnd"/>
       <w:r>
+        <w:rPr>
+          <w:color w:val="3333FF"/>
+        </w:rPr>
         <w:t>.</w:t>
       </w:r>
     </w:p>
@@ -40374,8 +40501,14 @@
           <w:numId w:val="56"/>
         </w:numPr>
         <w:spacing w:line="240" w:lineRule="auto"/>
-      </w:pPr>
-      <w:r>
+        <w:rPr>
+          <w:color w:val="3333FF"/>
+        </w:rPr>
+      </w:pPr>
+      <w:r>
+        <w:rPr>
+          <w:color w:val="3333FF"/>
+        </w:rPr>
         <w:t>Test with mock data for all asset classes, measuring latency (&lt;100μs for executions) and throughput (1M TPS prep).</w:t>
       </w:r>
     </w:p>
@@ -40386,15 +40519,22 @@
           <w:numId w:val="56"/>
         </w:numPr>
         <w:spacing w:line="240" w:lineRule="auto"/>
-      </w:pPr>
-      <w:r>
-        <w:rPr>
-          <w:b/>
-          <w:bCs/>
+        <w:rPr>
+          <w:color w:val="3333FF"/>
+        </w:rPr>
+      </w:pPr>
+      <w:r>
+        <w:rPr>
+          <w:b/>
+          <w:bCs/>
+          <w:color w:val="3333FF"/>
         </w:rPr>
         <w:t>Implement Multi-Source Data Feeds with Fallback Mechanism:</w:t>
       </w:r>
       <w:r>
+        <w:rPr>
+          <w:color w:val="3333FF"/>
+        </w:rPr>
         <w:t xml:space="preserve"> </w:t>
       </w:r>
     </w:p>
@@ -40405,48 +40545,84 @@
           <w:numId w:val="56"/>
         </w:numPr>
         <w:spacing w:line="240" w:lineRule="auto"/>
-      </w:pPr>
-      <w:r>
+        <w:rPr>
+          <w:color w:val="3333FF"/>
+        </w:rPr>
+      </w:pPr>
+      <w:r>
+        <w:rPr>
+          <w:color w:val="3333FF"/>
+        </w:rPr>
         <w:t xml:space="preserve">Set up primary (Yahoo Finance) and fallback providers (Alpha Vantage, </w:t>
       </w:r>
       <w:proofErr w:type="spellStart"/>
       <w:r>
+        <w:rPr>
+          <w:color w:val="3333FF"/>
+        </w:rPr>
         <w:t>Finnhub</w:t>
       </w:r>
       <w:proofErr w:type="spellEnd"/>
       <w:r>
+        <w:rPr>
+          <w:color w:val="3333FF"/>
+        </w:rPr>
         <w:t xml:space="preserve">, Investing.com, CME Group, Twelve Data, Polygon, </w:t>
       </w:r>
       <w:proofErr w:type="spellStart"/>
       <w:r>
+        <w:rPr>
+          <w:color w:val="3333FF"/>
+        </w:rPr>
         <w:t>Barchart</w:t>
       </w:r>
       <w:proofErr w:type="spellEnd"/>
       <w:r>
+        <w:rPr>
+          <w:color w:val="3333FF"/>
+        </w:rPr>
         <w:t xml:space="preserve">, </w:t>
       </w:r>
       <w:proofErr w:type="spellStart"/>
       <w:r>
+        <w:rPr>
+          <w:color w:val="3333FF"/>
+        </w:rPr>
         <w:t>SpiderRock</w:t>
       </w:r>
       <w:proofErr w:type="spellEnd"/>
       <w:r>
+        <w:rPr>
+          <w:color w:val="3333FF"/>
+        </w:rPr>
         <w:t xml:space="preserve">, </w:t>
       </w:r>
       <w:proofErr w:type="spellStart"/>
       <w:r>
+        <w:rPr>
+          <w:color w:val="3333FF"/>
+        </w:rPr>
         <w:t>TradingCharts</w:t>
       </w:r>
       <w:proofErr w:type="spellEnd"/>
       <w:r>
+        <w:rPr>
+          <w:color w:val="3333FF"/>
+        </w:rPr>
         <w:t xml:space="preserve">, </w:t>
       </w:r>
       <w:proofErr w:type="spellStart"/>
       <w:r>
+        <w:rPr>
+          <w:color w:val="3333FF"/>
+        </w:rPr>
         <w:t>Oanda</w:t>
       </w:r>
       <w:proofErr w:type="spellEnd"/>
       <w:r>
+        <w:rPr>
+          <w:color w:val="3333FF"/>
+        </w:rPr>
         <w:t>) per asset class, using Kafka to stream normalized data.</w:t>
       </w:r>
     </w:p>
@@ -40457,32 +40633,56 @@
           <w:numId w:val="56"/>
         </w:numPr>
         <w:spacing w:line="240" w:lineRule="auto"/>
-      </w:pPr>
-      <w:r>
+        <w:rPr>
+          <w:color w:val="3333FF"/>
+        </w:rPr>
+      </w:pPr>
+      <w:r>
+        <w:rPr>
+          <w:color w:val="3333FF"/>
+        </w:rPr>
         <w:t xml:space="preserve">Configure asset-specific chains: e.g., Stocks/ETFs (Yahoo → IBKR → Alpha Vantage → </w:t>
       </w:r>
       <w:proofErr w:type="spellStart"/>
       <w:r>
+        <w:rPr>
+          <w:color w:val="3333FF"/>
+        </w:rPr>
         <w:t>Finnhub</w:t>
       </w:r>
       <w:proofErr w:type="spellEnd"/>
       <w:r>
+        <w:rPr>
+          <w:color w:val="3333FF"/>
+        </w:rPr>
         <w:t xml:space="preserve"> → Twelve Data → Polygon); Options (Yahoo → IBKR → </w:t>
       </w:r>
       <w:proofErr w:type="spellStart"/>
       <w:r>
+        <w:rPr>
+          <w:color w:val="3333FF"/>
+        </w:rPr>
         <w:t>Cboe</w:t>
       </w:r>
       <w:proofErr w:type="spellEnd"/>
       <w:r>
+        <w:rPr>
+          <w:color w:val="3333FF"/>
+        </w:rPr>
         <w:t xml:space="preserve"> → </w:t>
       </w:r>
       <w:proofErr w:type="spellStart"/>
       <w:r>
+        <w:rPr>
+          <w:color w:val="3333FF"/>
+        </w:rPr>
         <w:t>SpiderRock</w:t>
       </w:r>
       <w:proofErr w:type="spellEnd"/>
       <w:r>
+        <w:rPr>
+          <w:color w:val="3333FF"/>
+        </w:rPr>
         <w:t>); ensure automatic switching on failure (e.g., timeout &gt;3s, error codes) with logging to Elasticsearch.</w:t>
       </w:r>
     </w:p>
@@ -40493,16 +40693,28 @@
           <w:numId w:val="56"/>
         </w:numPr>
         <w:spacing w:line="240" w:lineRule="auto"/>
-      </w:pPr>
-      <w:r>
+        <w:rPr>
+          <w:color w:val="3333FF"/>
+        </w:rPr>
+      </w:pPr>
+      <w:r>
+        <w:rPr>
+          <w:color w:val="3333FF"/>
+        </w:rPr>
         <w:t xml:space="preserve">Support historical data (free sources for paper, 5+ years depth for options chains) and real-time (IBKR subscriptions post-validation, including implied volatility surfaces and dividend forecasts via </w:t>
       </w:r>
       <w:proofErr w:type="spellStart"/>
       <w:r>
+        <w:rPr>
+          <w:color w:val="3333FF"/>
+        </w:rPr>
         <w:t>QuantLib</w:t>
       </w:r>
       <w:proofErr w:type="spellEnd"/>
       <w:r>
+        <w:rPr>
+          <w:color w:val="3333FF"/>
+        </w:rPr>
         <w:t>).</w:t>
       </w:r>
     </w:p>
@@ -40513,8 +40725,14 @@
           <w:numId w:val="56"/>
         </w:numPr>
         <w:spacing w:line="240" w:lineRule="auto"/>
-      </w:pPr>
-      <w:r>
+        <w:rPr>
+          <w:color w:val="3333FF"/>
+        </w:rPr>
+      </w:pPr>
+      <w:r>
+        <w:rPr>
+          <w:color w:val="3333FF"/>
+        </w:rPr>
         <w:t>Normalize data formats (e.g., unified tick/bar structures) and distribute via Kafka topics for consumption by services like Market Data Service.</w:t>
       </w:r>
     </w:p>
@@ -40525,15 +40743,22 @@
           <w:numId w:val="56"/>
         </w:numPr>
         <w:spacing w:line="240" w:lineRule="auto"/>
-      </w:pPr>
-      <w:r>
-        <w:rPr>
-          <w:b/>
-          <w:bCs/>
+        <w:rPr>
+          <w:color w:val="3333FF"/>
+        </w:rPr>
+      </w:pPr>
+      <w:r>
+        <w:rPr>
+          <w:b/>
+          <w:bCs/>
+          <w:color w:val="3333FF"/>
         </w:rPr>
         <w:t>Develop Custom Technical Analysis Indicators:</w:t>
       </w:r>
       <w:r>
+        <w:rPr>
+          <w:color w:val="3333FF"/>
+        </w:rPr>
         <w:t xml:space="preserve"> </w:t>
       </w:r>
     </w:p>
@@ -40544,32 +40769,56 @@
           <w:numId w:val="56"/>
         </w:numPr>
         <w:spacing w:line="240" w:lineRule="auto"/>
-      </w:pPr>
-      <w:r>
+        <w:rPr>
+          <w:color w:val="3333FF"/>
+        </w:rPr>
+      </w:pPr>
+      <w:r>
+        <w:rPr>
+          <w:color w:val="3333FF"/>
+        </w:rPr>
         <w:t xml:space="preserve">Build a comprehensive suite of 30+ custom volume-weighted indicators and metrics using TA-Lib/ta-lib-python (primary wrapper) &amp; </w:t>
       </w:r>
       <w:proofErr w:type="spellStart"/>
       <w:r>
+        <w:rPr>
+          <w:color w:val="3333FF"/>
+        </w:rPr>
         <w:t>Bukosabino</w:t>
       </w:r>
       <w:proofErr w:type="spellEnd"/>
       <w:r>
+        <w:rPr>
+          <w:color w:val="3333FF"/>
+        </w:rPr>
         <w:t xml:space="preserve">/ta (secondary), NumPy for calculations, and integrate into </w:t>
       </w:r>
       <w:proofErr w:type="spellStart"/>
       <w:r>
+        <w:rPr>
+          <w:color w:val="3333FF"/>
+        </w:rPr>
         <w:t>NautilusTrader</w:t>
       </w:r>
       <w:proofErr w:type="spellEnd"/>
       <w:r>
+        <w:rPr>
+          <w:color w:val="3333FF"/>
+        </w:rPr>
         <w:t xml:space="preserve"> for use in strategies, </w:t>
       </w:r>
       <w:proofErr w:type="spellStart"/>
       <w:r>
+        <w:rPr>
+          <w:color w:val="3333FF"/>
+        </w:rPr>
         <w:t>backtesting</w:t>
       </w:r>
       <w:proofErr w:type="spellEnd"/>
       <w:r>
+        <w:rPr>
+          <w:color w:val="3333FF"/>
+        </w:rPr>
         <w:t>, and analysis.</w:t>
       </w:r>
     </w:p>
@@ -40580,16 +40829,28 @@
           <w:numId w:val="56"/>
         </w:numPr>
         <w:spacing w:line="240" w:lineRule="auto"/>
-      </w:pPr>
-      <w:r>
+        <w:rPr>
+          <w:color w:val="3333FF"/>
+        </w:rPr>
+      </w:pPr>
+      <w:r>
+        <w:rPr>
+          <w:color w:val="3333FF"/>
+        </w:rPr>
         <w:t xml:space="preserve">Indicators include: Beta vs. Market Index, Auto Correlation, Historical/Intraday Annual Volatility, VW SMA (55/13/5/34 Day of Open/High/Low), VW EMA (13 Day of Open, 5 Day of HLC), VW MACD (12/26/9 Day of HLC), VW MACD Histogram, VW MFI (14 Day of HLC), VW SMA of MFI (34/21 Day), Normalized ATR (21/8 Day VW for Positional/Intraday), Rupee/Dollar Volatility Risk, Contract Risk (2N/0.75N Units), Max Lots per Unit Risk, ATR Percent (21/8 Day), Strength/Weakness (21/8 Day </w:t>
       </w:r>
       <w:proofErr w:type="spellStart"/>
       <w:r>
+        <w:rPr>
+          <w:color w:val="3333FF"/>
+        </w:rPr>
         <w:t>Avg</w:t>
       </w:r>
       <w:proofErr w:type="spellEnd"/>
       <w:r>
+        <w:rPr>
+          <w:color w:val="3333FF"/>
+        </w:rPr>
         <w:t xml:space="preserve"> HLC &amp; ATR), SMA Average % Change (8/13/21 Day), Buy/Sell Easier Day, Choppy Market Index (21/8 Day), Market Mode (Trending/Choppy), High Low Range Average for ORB.</w:t>
       </w:r>
     </w:p>
@@ -41246,12 +41507,14 @@
         <w:rPr>
           <w:b/>
           <w:bCs/>
-        </w:rPr>
-      </w:pPr>
-      <w:r>
-        <w:rPr>
-          <w:b/>
-          <w:bCs/>
+          <w:color w:val="3333FF"/>
+        </w:rPr>
+      </w:pPr>
+      <w:r>
+        <w:rPr>
+          <w:b/>
+          <w:bCs/>
+          <w:color w:val="3333FF"/>
         </w:rPr>
         <w:t>Integration Plan - Phase 1: Immediate Priority - Core System Validation &amp; Hardening</w:t>
       </w:r>
@@ -41263,15 +41526,22 @@
           <w:numId w:val="57"/>
         </w:numPr>
         <w:spacing w:line="240" w:lineRule="auto"/>
-      </w:pPr>
-      <w:r>
-        <w:rPr>
-          <w:b/>
-          <w:bCs/>
+        <w:rPr>
+          <w:color w:val="3333FF"/>
+        </w:rPr>
+      </w:pPr>
+      <w:r>
+        <w:rPr>
+          <w:b/>
+          <w:bCs/>
+          <w:color w:val="3333FF"/>
         </w:rPr>
         <w:t>Objective:</w:t>
       </w:r>
       <w:r>
+        <w:rPr>
+          <w:color w:val="3333FF"/>
+        </w:rPr>
         <w:t xml:space="preserve"> </w:t>
       </w:r>
     </w:p>
@@ -41282,32 +41552,56 @@
           <w:numId w:val="57"/>
         </w:numPr>
         <w:spacing w:line="240" w:lineRule="auto"/>
-      </w:pPr>
-      <w:r>
+        <w:rPr>
+          <w:color w:val="3333FF"/>
+        </w:rPr>
+      </w:pPr>
+      <w:r>
+        <w:rPr>
+          <w:color w:val="3333FF"/>
+        </w:rPr>
         <w:t xml:space="preserve">To integrate and validate the core components of the algorithmic trading platform, hardening them for performance, security, and reliability. This plan focuses on </w:t>
       </w:r>
       <w:proofErr w:type="spellStart"/>
       <w:r>
+        <w:rPr>
+          <w:color w:val="3333FF"/>
+        </w:rPr>
         <w:t>NautilusTrader</w:t>
       </w:r>
       <w:proofErr w:type="spellEnd"/>
       <w:r>
+        <w:rPr>
+          <w:color w:val="3333FF"/>
+        </w:rPr>
         <w:t xml:space="preserve"> setup with IBKR paper trading, data feed fallbacks, custom technical indicators, API layers, database configurations, Kafka event bus, security hardening (zero-trust, encryption, threat </w:t>
       </w:r>
       <w:proofErr w:type="spellStart"/>
       <w:r>
+        <w:rPr>
+          <w:color w:val="3333FF"/>
+        </w:rPr>
         <w:t>modeling</w:t>
       </w:r>
       <w:proofErr w:type="spellEnd"/>
       <w:r>
+        <w:rPr>
+          <w:color w:val="3333FF"/>
+        </w:rPr>
         <w:t xml:space="preserve">), and backups, ensuring alignment with microservices, event-driven, cloud-native, and API-first principles. It prepares the foundation for high-frequency trading across assets, with custom features like volume-weighted indicators and event </w:t>
       </w:r>
       <w:proofErr w:type="spellStart"/>
       <w:r>
+        <w:rPr>
+          <w:color w:val="3333FF"/>
+        </w:rPr>
         <w:t>replayability</w:t>
       </w:r>
       <w:proofErr w:type="spellEnd"/>
       <w:r>
+        <w:rPr>
+          <w:color w:val="3333FF"/>
+        </w:rPr>
         <w:t>.</w:t>
       </w:r>
     </w:p>
@@ -41318,15 +41612,22 @@
           <w:numId w:val="57"/>
         </w:numPr>
         <w:spacing w:line="240" w:lineRule="auto"/>
-      </w:pPr>
-      <w:r>
-        <w:rPr>
-          <w:b/>
-          <w:bCs/>
+        <w:rPr>
+          <w:color w:val="3333FF"/>
+        </w:rPr>
+      </w:pPr>
+      <w:r>
+        <w:rPr>
+          <w:b/>
+          <w:bCs/>
+          <w:color w:val="3333FF"/>
         </w:rPr>
         <w:t>Key Tasks:</w:t>
       </w:r>
       <w:r>
+        <w:rPr>
+          <w:color w:val="3333FF"/>
+        </w:rPr>
         <w:t xml:space="preserve"> </w:t>
       </w:r>
     </w:p>
@@ -41337,12 +41638,16 @@
           <w:numId w:val="57"/>
         </w:numPr>
         <w:spacing w:line="240" w:lineRule="auto"/>
-      </w:pPr>
-      <w:proofErr w:type="spellStart"/>
-      <w:r>
-        <w:rPr>
-          <w:b/>
-          <w:bCs/>
+        <w:rPr>
+          <w:color w:val="3333FF"/>
+        </w:rPr>
+      </w:pPr>
+      <w:proofErr w:type="spellStart"/>
+      <w:r>
+        <w:rPr>
+          <w:b/>
+          <w:bCs/>
+          <w:color w:val="3333FF"/>
         </w:rPr>
         <w:t>NautilusTrader</w:t>
       </w:r>
@@ -41351,10 +41656,14 @@
         <w:rPr>
           <w:b/>
           <w:bCs/>
+          <w:color w:val="3333FF"/>
         </w:rPr>
         <w:t xml:space="preserve"> Integration for Paper Trading:</w:t>
       </w:r>
       <w:r>
+        <w:rPr>
+          <w:color w:val="3333FF"/>
+        </w:rPr>
         <w:t xml:space="preserve"> </w:t>
       </w:r>
     </w:p>
@@ -41365,16 +41674,28 @@
           <w:numId w:val="57"/>
         </w:numPr>
         <w:spacing w:line="240" w:lineRule="auto"/>
-      </w:pPr>
-      <w:r>
+        <w:rPr>
+          <w:color w:val="3333FF"/>
+        </w:rPr>
+      </w:pPr>
+      <w:r>
+        <w:rPr>
+          <w:color w:val="3333FF"/>
+        </w:rPr>
         <w:t xml:space="preserve">Use </w:t>
       </w:r>
       <w:proofErr w:type="spellStart"/>
       <w:r>
+        <w:rPr>
+          <w:color w:val="3333FF"/>
+        </w:rPr>
         <w:t>NautilusTrader's</w:t>
       </w:r>
       <w:proofErr w:type="spellEnd"/>
       <w:r>
+        <w:rPr>
+          <w:color w:val="3333FF"/>
+        </w:rPr>
         <w:t xml:space="preserve"> IBKR adapter to connect to paper accounts, implementing order management and mode switching.</w:t>
       </w:r>
     </w:p>
@@ -41385,8 +41706,14 @@
           <w:numId w:val="57"/>
         </w:numPr>
         <w:spacing w:line="240" w:lineRule="auto"/>
-      </w:pPr>
-      <w:r>
+        <w:rPr>
+          <w:color w:val="3333FF"/>
+        </w:rPr>
+      </w:pPr>
+      <w:r>
+        <w:rPr>
+          <w:color w:val="3333FF"/>
+        </w:rPr>
         <w:t>Develop prototype interface (Next.js) for toggling modes, ensuring broker compliance (e.g., API rate limits).</w:t>
       </w:r>
     </w:p>
@@ -41397,16 +41724,28 @@
           <w:numId w:val="57"/>
         </w:numPr>
         <w:spacing w:line="240" w:lineRule="auto"/>
-      </w:pPr>
-      <w:r>
+        <w:rPr>
+          <w:color w:val="3333FF"/>
+        </w:rPr>
+      </w:pPr>
+      <w:r>
+        <w:rPr>
+          <w:color w:val="3333FF"/>
+        </w:rPr>
         <w:t xml:space="preserve">Test pipeline with a sample algorithm: Data fetch → </w:t>
       </w:r>
       <w:proofErr w:type="spellStart"/>
       <w:r>
+        <w:rPr>
+          <w:color w:val="3333FF"/>
+        </w:rPr>
         <w:t>backtest</w:t>
       </w:r>
       <w:proofErr w:type="spellEnd"/>
       <w:r>
+        <w:rPr>
+          <w:color w:val="3333FF"/>
+        </w:rPr>
         <w:t xml:space="preserve"> → results, logging events to Kafka.</w:t>
       </w:r>
     </w:p>
@@ -41417,15 +41756,22 @@
           <w:numId w:val="57"/>
         </w:numPr>
         <w:spacing w:line="240" w:lineRule="auto"/>
-      </w:pPr>
-      <w:r>
-        <w:rPr>
-          <w:b/>
-          <w:bCs/>
+        <w:rPr>
+          <w:color w:val="3333FF"/>
+        </w:rPr>
+      </w:pPr>
+      <w:r>
+        <w:rPr>
+          <w:b/>
+          <w:bCs/>
+          <w:color w:val="3333FF"/>
         </w:rPr>
         <w:t>Multi-Source Data Feed and Fallback Implementation:</w:t>
       </w:r>
       <w:r>
+        <w:rPr>
+          <w:color w:val="3333FF"/>
+        </w:rPr>
         <w:t xml:space="preserve"> </w:t>
       </w:r>
     </w:p>
@@ -41436,8 +41782,14 @@
           <w:numId w:val="57"/>
         </w:numPr>
         <w:spacing w:line="240" w:lineRule="auto"/>
-      </w:pPr>
-      <w:r>
+        <w:rPr>
+          <w:color w:val="3333FF"/>
+        </w:rPr>
+      </w:pPr>
+      <w:r>
+        <w:rPr>
+          <w:color w:val="3333FF"/>
+        </w:rPr>
         <w:t>Configure providers with Kafka streaming: Primary Yahoo, asset-specific fallbacks (e.g., logic in Python/Go service to switch on failure).</w:t>
       </w:r>
     </w:p>
@@ -41448,16 +41800,28 @@
           <w:numId w:val="57"/>
         </w:numPr>
         <w:spacing w:line="240" w:lineRule="auto"/>
-      </w:pPr>
-      <w:r>
+        <w:rPr>
+          <w:color w:val="3333FF"/>
+        </w:rPr>
+      </w:pPr>
+      <w:r>
+        <w:rPr>
+          <w:color w:val="3333FF"/>
+        </w:rPr>
         <w:t xml:space="preserve">Normalize data and handle historical/real-time (IBKR for live prep), including options data requirements (IV surfaces via </w:t>
       </w:r>
       <w:proofErr w:type="spellStart"/>
       <w:r>
+        <w:rPr>
+          <w:color w:val="3333FF"/>
+        </w:rPr>
         <w:t>QuantLib</w:t>
       </w:r>
       <w:proofErr w:type="spellEnd"/>
       <w:r>
+        <w:rPr>
+          <w:color w:val="3333FF"/>
+        </w:rPr>
         <w:t>).</w:t>
       </w:r>
     </w:p>
@@ -41468,8 +41832,14 @@
           <w:numId w:val="57"/>
         </w:numPr>
         <w:spacing w:line="240" w:lineRule="auto"/>
-      </w:pPr>
-      <w:r>
+        <w:rPr>
+          <w:color w:val="3333FF"/>
+        </w:rPr>
+      </w:pPr>
+      <w:r>
+        <w:rPr>
+          <w:color w:val="3333FF"/>
+        </w:rPr>
         <w:t>Test uninterrupted availability: Simulate failures, measure switch time (&lt;1ms), validate with multi-asset mocks.</w:t>
       </w:r>
     </w:p>
@@ -41480,15 +41850,22 @@
           <w:numId w:val="57"/>
         </w:numPr>
         <w:spacing w:line="240" w:lineRule="auto"/>
-      </w:pPr>
-      <w:r>
-        <w:rPr>
-          <w:b/>
-          <w:bCs/>
+        <w:rPr>
+          <w:color w:val="3333FF"/>
+        </w:rPr>
+      </w:pPr>
+      <w:r>
+        <w:rPr>
+          <w:b/>
+          <w:bCs/>
+          <w:color w:val="3333FF"/>
         </w:rPr>
         <w:t>Custom Technical Analysis Development:</w:t>
       </w:r>
       <w:r>
+        <w:rPr>
+          <w:color w:val="3333FF"/>
+        </w:rPr>
         <w:t xml:space="preserve"> </w:t>
       </w:r>
     </w:p>
@@ -41499,16 +41876,28 @@
           <w:numId w:val="57"/>
         </w:numPr>
         <w:spacing w:line="240" w:lineRule="auto"/>
-      </w:pPr>
-      <w:r>
+        <w:rPr>
+          <w:color w:val="3333FF"/>
+        </w:rPr>
+      </w:pPr>
+      <w:r>
+        <w:rPr>
+          <w:color w:val="3333FF"/>
+        </w:rPr>
         <w:t xml:space="preserve">Implement 30+ indicators in Python (TA-Lib/NumPy), with functions for each (e.g., </w:t>
       </w:r>
       <w:proofErr w:type="spellStart"/>
       <w:r>
+        <w:rPr>
+          <w:color w:val="3333FF"/>
+        </w:rPr>
         <w:t>vw_sma</w:t>
       </w:r>
       <w:proofErr w:type="spellEnd"/>
       <w:r>
+        <w:rPr>
+          <w:color w:val="3333FF"/>
+        </w:rPr>
         <w:t>(prices, volumes, period)).</w:t>
       </w:r>
     </w:p>

</xml_diff>